<commit_message>
IKSS is almost done
</commit_message>
<xml_diff>
--- a/АИС/LB_2/АИС_Смирнов_Б.В._Лабораторная_работа_2.docx
+++ b/АИС/LB_2/АИС_Смирнов_Б.В._Лабораторная_работа_2.docx
@@ -37,15 +37,7 @@
     <w:p/>
     <w:p>
       <w:r>
-        <w:t xml:space="preserve">Изучить основные сведения о брандмауэрах, их типы и организацию. Рассмотреть простейшие возможности брандмауэра на примере программы </w:t>
-      </w:r>
-      <w:proofErr w:type="spellStart"/>
-      <w:r>
-        <w:t>Iptables</w:t>
-      </w:r>
-      <w:proofErr w:type="spellEnd"/>
-      <w:r>
-        <w:t>. Изучить порядок движения транзитных пакетов, пакетов для локального приложения и от локальных процессов.</w:t>
+        <w:t>Изучить основные сведения о брандмауэрах, их типы и организацию. Рассмотреть простейшие возможности брандмауэра на примере программы Iptables. Изучить порядок движения транзитных пакетов, пакетов для локального приложения и от локальных процессов.</w:t>
       </w:r>
     </w:p>
     <w:p/>
@@ -83,15 +75,7 @@
         </w:numPr>
       </w:pPr>
       <w:r>
-        <w:t xml:space="preserve">Имеется сервер локальной сети со службой </w:t>
-      </w:r>
-      <w:proofErr w:type="spellStart"/>
-      <w:r>
-        <w:t>http</w:t>
-      </w:r>
-      <w:proofErr w:type="spellEnd"/>
-      <w:r>
-        <w:t xml:space="preserve">. Необходимо настроить доступ к серверу. Для этого выполнить следующие действия: </w:t>
+        <w:t xml:space="preserve">Имеется сервер локальной сети со службой http. Необходимо настроить доступ к серверу. Для этого выполнить следующие действия: </w:t>
       </w:r>
     </w:p>
     <w:p>
@@ -137,13 +121,8 @@
           <w:lang w:val="en-US"/>
         </w:rPr>
       </w:pPr>
-      <w:proofErr w:type="spellStart"/>
-      <w:r>
-        <w:t>iptables</w:t>
-      </w:r>
-      <w:proofErr w:type="spellEnd"/>
-      <w:r>
-        <w:t xml:space="preserve"> –F</w:t>
+      <w:r>
+        <w:t>iptables –F</w:t>
       </w:r>
     </w:p>
     <w:p>
@@ -177,9 +156,6 @@
       <w:pPr>
         <w:pStyle w:val="a1"/>
         <w:ind w:left="709" w:firstLine="0"/>
-        <w:rPr>
-          <w:lang w:val="en-US"/>
-        </w:rPr>
       </w:pPr>
     </w:p>
     <w:p>
@@ -258,9 +234,6 @@
       <w:pPr>
         <w:pStyle w:val="a1"/>
         <w:ind w:left="709" w:firstLine="0"/>
-        <w:rPr>
-          <w:lang w:val="en-US"/>
-        </w:rPr>
       </w:pPr>
     </w:p>
     <w:p>
@@ -321,62 +294,50 @@
           <w:ilvl w:val="1"/>
           <w:numId w:val="2"/>
         </w:numPr>
-        <w:rPr>
-          <w:lang w:val="en-US"/>
-        </w:rPr>
       </w:pPr>
       <w:r>
         <w:t>Разрешить</w:t>
       </w:r>
       <w:r>
-        <w:rPr>
-          <w:lang w:val="en-US"/>
-        </w:rPr>
         <w:t xml:space="preserve"> </w:t>
       </w:r>
       <w:r>
         <w:t>входящий</w:t>
       </w:r>
       <w:r>
-        <w:rPr>
-          <w:lang w:val="en-US"/>
-        </w:rPr>
         <w:t xml:space="preserve"> </w:t>
       </w:r>
       <w:r>
         <w:t>запрос</w:t>
       </w:r>
       <w:r>
-        <w:rPr>
-          <w:lang w:val="en-US"/>
-        </w:rPr>
         <w:t xml:space="preserve"> </w:t>
       </w:r>
       <w:r>
         <w:t>по</w:t>
       </w:r>
       <w:r>
-        <w:rPr>
-          <w:lang w:val="en-US"/>
-        </w:rPr>
-        <w:t xml:space="preserve"> HTTP </w:t>
+        <w:t xml:space="preserve"> </w:t>
+      </w:r>
+      <w:r>
+        <w:rPr>
+          <w:lang w:val="en-US"/>
+        </w:rPr>
+        <w:t>HTTP</w:t>
+      </w:r>
+      <w:r>
+        <w:t xml:space="preserve"> </w:t>
       </w:r>
       <w:r>
         <w:t>протоколу</w:t>
       </w:r>
       <w:r>
-        <w:rPr>
-          <w:lang w:val="en-US"/>
-        </w:rPr>
         <w:t xml:space="preserve"> </w:t>
       </w:r>
       <w:r>
         <w:t>командой</w:t>
       </w:r>
       <w:r>
-        <w:rPr>
-          <w:lang w:val="en-US"/>
-        </w:rPr>
         <w:t xml:space="preserve"> </w:t>
       </w:r>
     </w:p>
@@ -384,9 +345,6 @@
       <w:pPr>
         <w:pStyle w:val="a1"/>
         <w:ind w:left="709" w:firstLine="0"/>
-        <w:rPr>
-          <w:lang w:val="en-US"/>
-        </w:rPr>
       </w:pPr>
     </w:p>
     <w:p>
@@ -401,35 +359,7 @@
         <w:rPr>
           <w:lang w:val="en-US"/>
         </w:rPr>
-        <w:t xml:space="preserve">iptables –A INPUT –p </w:t>
-      </w:r>
-      <w:proofErr w:type="spellStart"/>
-      <w:r>
-        <w:rPr>
-          <w:lang w:val="en-US"/>
-        </w:rPr>
-        <w:t>tcp</w:t>
-      </w:r>
-      <w:proofErr w:type="spellEnd"/>
-      <w:r>
-        <w:rPr>
-          <w:lang w:val="en-US"/>
-        </w:rPr>
-        <w:t xml:space="preserve"> –</w:t>
-      </w:r>
-      <w:proofErr w:type="spellStart"/>
-      <w:r>
-        <w:rPr>
-          <w:lang w:val="en-US"/>
-        </w:rPr>
-        <w:t>dport</w:t>
-      </w:r>
-      <w:proofErr w:type="spellEnd"/>
-      <w:r>
-        <w:rPr>
-          <w:lang w:val="en-US"/>
-        </w:rPr>
-        <w:t xml:space="preserve"> 80 –j ACCEPT </w:t>
+        <w:t xml:space="preserve">iptables –A INPUT –p tcp –dport 80 –j ACCEPT </w:t>
       </w:r>
     </w:p>
     <w:p>
@@ -488,16 +418,474 @@
           <w:numId w:val="3"/>
         </w:numPr>
       </w:pPr>
+      <w:r>
+        <w:t>Была произведена настройка доступа к серверу</w:t>
+      </w:r>
+      <w:r>
+        <w:t>:</w:t>
+      </w:r>
+    </w:p>
+    <w:p>
+      <w:pPr>
+        <w:pStyle w:val="a1"/>
+        <w:numPr>
+          <w:ilvl w:val="1"/>
+          <w:numId w:val="3"/>
+        </w:numPr>
+      </w:pPr>
+      <w:r>
+        <w:t>Сброшены все цепочки (Рисунок 1).</w:t>
+      </w:r>
+    </w:p>
+    <w:p>
+      <w:pPr>
+        <w:pStyle w:val="a1"/>
+        <w:ind w:firstLine="0"/>
+      </w:pPr>
+    </w:p>
+    <w:p>
+      <w:pPr>
+        <w:pStyle w:val="a1"/>
+        <w:ind w:firstLine="0"/>
+        <w:jc w:val="center"/>
+      </w:pPr>
+      <w:r>
+        <w:drawing>
+          <wp:inline distT="0" distB="0" distL="0" distR="0" wp14:anchorId="76CCEB16" wp14:editId="2E63953E">
+            <wp:extent cx="2724530" cy="657317"/>
+            <wp:effectExtent l="0" t="0" r="0" b="9525"/>
+            <wp:docPr id="1037736704" name="Picture 1"/>
+            <wp:cNvGraphicFramePr>
+              <a:graphicFrameLocks xmlns:a="http://schemas.openxmlformats.org/drawingml/2006/main" noChangeAspect="1"/>
+            </wp:cNvGraphicFramePr>
+            <a:graphic xmlns:a="http://schemas.openxmlformats.org/drawingml/2006/main">
+              <a:graphicData uri="http://schemas.openxmlformats.org/drawingml/2006/picture">
+                <pic:pic xmlns:pic="http://schemas.openxmlformats.org/drawingml/2006/picture">
+                  <pic:nvPicPr>
+                    <pic:cNvPr id="1037736704" name=""/>
+                    <pic:cNvPicPr/>
+                  </pic:nvPicPr>
+                  <pic:blipFill>
+                    <a:blip r:embed="rId5"/>
+                    <a:stretch>
+                      <a:fillRect/>
+                    </a:stretch>
+                  </pic:blipFill>
+                  <pic:spPr>
+                    <a:xfrm>
+                      <a:off x="0" y="0"/>
+                      <a:ext cx="2724530" cy="657317"/>
+                    </a:xfrm>
+                    <a:prstGeom prst="rect">
+                      <a:avLst/>
+                    </a:prstGeom>
+                  </pic:spPr>
+                </pic:pic>
+              </a:graphicData>
+            </a:graphic>
+          </wp:inline>
+        </w:drawing>
+      </w:r>
+    </w:p>
+    <w:p>
+      <w:pPr>
+        <w:pStyle w:val="a1"/>
+        <w:ind w:firstLine="0"/>
+        <w:jc w:val="center"/>
+        <w:rPr>
+          <w:lang w:val="en-US"/>
+        </w:rPr>
+      </w:pPr>
+      <w:r>
+        <w:t xml:space="preserve">Рисунок 1 – сброс цепочек </w:t>
+      </w:r>
+      <w:r>
+        <w:rPr>
+          <w:lang w:val="en-US"/>
+        </w:rPr>
+        <w:t>iptables</w:t>
+      </w:r>
+    </w:p>
+    <w:p>
+      <w:pPr>
+        <w:pStyle w:val="a1"/>
+        <w:ind w:firstLine="0"/>
+      </w:pPr>
+    </w:p>
+    <w:p>
+      <w:pPr>
+        <w:pStyle w:val="a1"/>
+        <w:numPr>
+          <w:ilvl w:val="1"/>
+          <w:numId w:val="3"/>
+        </w:numPr>
+      </w:pPr>
+      <w:r>
+        <w:t xml:space="preserve"> Установлены политики по умолчанию (Рисунок 2).</w:t>
+      </w:r>
+    </w:p>
+    <w:p>
+      <w:pPr>
+        <w:pStyle w:val="a1"/>
+        <w:ind w:firstLine="0"/>
+      </w:pPr>
+    </w:p>
+    <w:p>
+      <w:pPr>
+        <w:pStyle w:val="a1"/>
+        <w:ind w:firstLine="0"/>
+        <w:jc w:val="center"/>
+      </w:pPr>
+      <w:r>
+        <w:drawing>
+          <wp:inline distT="0" distB="0" distL="0" distR="0" wp14:anchorId="5C8D0738" wp14:editId="295AE189">
+            <wp:extent cx="3648584" cy="581106"/>
+            <wp:effectExtent l="0" t="0" r="9525" b="9525"/>
+            <wp:docPr id="1863722187" name="Picture 1"/>
+            <wp:cNvGraphicFramePr>
+              <a:graphicFrameLocks xmlns:a="http://schemas.openxmlformats.org/drawingml/2006/main" noChangeAspect="1"/>
+            </wp:cNvGraphicFramePr>
+            <a:graphic xmlns:a="http://schemas.openxmlformats.org/drawingml/2006/main">
+              <a:graphicData uri="http://schemas.openxmlformats.org/drawingml/2006/picture">
+                <pic:pic xmlns:pic="http://schemas.openxmlformats.org/drawingml/2006/picture">
+                  <pic:nvPicPr>
+                    <pic:cNvPr id="1863722187" name=""/>
+                    <pic:cNvPicPr/>
+                  </pic:nvPicPr>
+                  <pic:blipFill>
+                    <a:blip r:embed="rId6"/>
+                    <a:stretch>
+                      <a:fillRect/>
+                    </a:stretch>
+                  </pic:blipFill>
+                  <pic:spPr>
+                    <a:xfrm>
+                      <a:off x="0" y="0"/>
+                      <a:ext cx="3648584" cy="581106"/>
+                    </a:xfrm>
+                    <a:prstGeom prst="rect">
+                      <a:avLst/>
+                    </a:prstGeom>
+                  </pic:spPr>
+                </pic:pic>
+              </a:graphicData>
+            </a:graphic>
+          </wp:inline>
+        </w:drawing>
+      </w:r>
+    </w:p>
+    <w:p>
+      <w:pPr>
+        <w:pStyle w:val="a1"/>
+        <w:ind w:firstLine="0"/>
+        <w:jc w:val="center"/>
+      </w:pPr>
+      <w:r>
+        <w:t>Рисунок 2 – Установка политик</w:t>
+      </w:r>
+    </w:p>
+    <w:p>
+      <w:pPr>
+        <w:pStyle w:val="a1"/>
+        <w:ind w:firstLine="0"/>
+        <w:jc w:val="center"/>
+      </w:pPr>
+    </w:p>
+    <w:p>
+      <w:pPr>
+        <w:pStyle w:val="a1"/>
+        <w:numPr>
+          <w:ilvl w:val="1"/>
+          <w:numId w:val="3"/>
+        </w:numPr>
+      </w:pPr>
+      <w:r>
+        <w:t>Было р</w:t>
+      </w:r>
+      <w:r>
+        <w:t>азреш</w:t>
+      </w:r>
+      <w:r>
+        <w:t>ено</w:t>
+      </w:r>
+      <w:r>
+        <w:t xml:space="preserve"> прохождение данных существующих и «связанных» соединений</w:t>
+      </w:r>
+      <w:r>
+        <w:t xml:space="preserve"> (Рисунок 2)</w:t>
+      </w:r>
+      <w:r>
+        <w:t>.</w:t>
+      </w:r>
+    </w:p>
+    <w:p>
+      <w:pPr>
+        <w:pStyle w:val="a1"/>
+        <w:ind w:firstLine="0"/>
+      </w:pPr>
+    </w:p>
+    <w:p>
+      <w:pPr>
+        <w:pStyle w:val="a1"/>
+        <w:ind w:firstLine="0"/>
+        <w:jc w:val="center"/>
+        <w:rPr>
+          <w:lang w:val="en-US"/>
+        </w:rPr>
+      </w:pPr>
+      <w:r>
+        <w:rPr>
+          <w:lang w:val="en-US"/>
+        </w:rPr>
+        <w:drawing>
+          <wp:inline distT="0" distB="0" distL="0" distR="0" wp14:anchorId="3E975825" wp14:editId="58BD10C1">
+            <wp:extent cx="5940425" cy="493395"/>
+            <wp:effectExtent l="0" t="0" r="3175" b="1905"/>
+            <wp:docPr id="1516859286" name="Picture 1"/>
+            <wp:cNvGraphicFramePr>
+              <a:graphicFrameLocks xmlns:a="http://schemas.openxmlformats.org/drawingml/2006/main" noChangeAspect="1"/>
+            </wp:cNvGraphicFramePr>
+            <a:graphic xmlns:a="http://schemas.openxmlformats.org/drawingml/2006/main">
+              <a:graphicData uri="http://schemas.openxmlformats.org/drawingml/2006/picture">
+                <pic:pic xmlns:pic="http://schemas.openxmlformats.org/drawingml/2006/picture">
+                  <pic:nvPicPr>
+                    <pic:cNvPr id="1516859286" name=""/>
+                    <pic:cNvPicPr/>
+                  </pic:nvPicPr>
+                  <pic:blipFill>
+                    <a:blip r:embed="rId7"/>
+                    <a:stretch>
+                      <a:fillRect/>
+                    </a:stretch>
+                  </pic:blipFill>
+                  <pic:spPr>
+                    <a:xfrm>
+                      <a:off x="0" y="0"/>
+                      <a:ext cx="5940425" cy="493395"/>
+                    </a:xfrm>
+                    <a:prstGeom prst="rect">
+                      <a:avLst/>
+                    </a:prstGeom>
+                  </pic:spPr>
+                </pic:pic>
+              </a:graphicData>
+            </a:graphic>
+          </wp:inline>
+        </w:drawing>
+      </w:r>
+    </w:p>
+    <w:p>
+      <w:pPr>
+        <w:pStyle w:val="a1"/>
+        <w:ind w:firstLine="0"/>
+        <w:jc w:val="center"/>
+      </w:pPr>
+      <w:r>
+        <w:t>Рисунок 3 – Установка разрешений для уже существующих и связанных соединений</w:t>
+      </w:r>
+    </w:p>
+    <w:p>
+      <w:pPr>
+        <w:pStyle w:val="a1"/>
+        <w:ind w:firstLine="0"/>
+        <w:jc w:val="center"/>
+      </w:pPr>
+    </w:p>
+    <w:p>
+      <w:pPr>
+        <w:pStyle w:val="a1"/>
+        <w:numPr>
+          <w:ilvl w:val="1"/>
+          <w:numId w:val="3"/>
+        </w:numPr>
+      </w:pPr>
+      <w:r>
+        <w:t xml:space="preserve">Установка разрешения входящим запросам по </w:t>
+      </w:r>
+      <w:r>
+        <w:rPr>
+          <w:lang w:val="en-US"/>
+        </w:rPr>
+        <w:t>HTTP</w:t>
+      </w:r>
+      <w:r>
+        <w:t xml:space="preserve"> протоколу (Рисунок 4)</w:t>
+      </w:r>
+      <w:r>
+        <w:t>.</w:t>
+      </w:r>
+    </w:p>
+    <w:p>
+      <w:pPr>
+        <w:pStyle w:val="a1"/>
+        <w:ind w:firstLine="0"/>
+        <w:rPr>
+          <w:lang w:val="en-US"/>
+        </w:rPr>
+      </w:pPr>
+    </w:p>
+    <w:p>
+      <w:pPr>
+        <w:pStyle w:val="a1"/>
+        <w:ind w:firstLine="0"/>
+        <w:jc w:val="center"/>
+        <w:rPr>
+          <w:lang w:val="en-US"/>
+        </w:rPr>
+      </w:pPr>
+      <w:r>
+        <w:drawing>
+          <wp:inline distT="0" distB="0" distL="0" distR="0" wp14:anchorId="345F6374" wp14:editId="4A771A7A">
+            <wp:extent cx="5249008" cy="428685"/>
+            <wp:effectExtent l="0" t="0" r="0" b="9525"/>
+            <wp:docPr id="1286841086" name="Picture 1"/>
+            <wp:cNvGraphicFramePr>
+              <a:graphicFrameLocks xmlns:a="http://schemas.openxmlformats.org/drawingml/2006/main" noChangeAspect="1"/>
+            </wp:cNvGraphicFramePr>
+            <a:graphic xmlns:a="http://schemas.openxmlformats.org/drawingml/2006/main">
+              <a:graphicData uri="http://schemas.openxmlformats.org/drawingml/2006/picture">
+                <pic:pic xmlns:pic="http://schemas.openxmlformats.org/drawingml/2006/picture">
+                  <pic:nvPicPr>
+                    <pic:cNvPr id="1286841086" name=""/>
+                    <pic:cNvPicPr/>
+                  </pic:nvPicPr>
+                  <pic:blipFill>
+                    <a:blip r:embed="rId8"/>
+                    <a:stretch>
+                      <a:fillRect/>
+                    </a:stretch>
+                  </pic:blipFill>
+                  <pic:spPr>
+                    <a:xfrm>
+                      <a:off x="0" y="0"/>
+                      <a:ext cx="5249008" cy="428685"/>
+                    </a:xfrm>
+                    <a:prstGeom prst="rect">
+                      <a:avLst/>
+                    </a:prstGeom>
+                  </pic:spPr>
+                </pic:pic>
+              </a:graphicData>
+            </a:graphic>
+          </wp:inline>
+        </w:drawing>
+      </w:r>
+    </w:p>
+    <w:p>
+      <w:pPr>
+        <w:pStyle w:val="a1"/>
+        <w:ind w:firstLine="0"/>
+        <w:jc w:val="center"/>
+        <w:rPr>
+          <w:lang w:val="en-US"/>
+        </w:rPr>
+      </w:pPr>
+      <w:r>
+        <w:t xml:space="preserve">Рисунок 4 </w:t>
+      </w:r>
+      <w:r>
+        <w:t>–</w:t>
+      </w:r>
+      <w:r>
+        <w:t xml:space="preserve"> </w:t>
+      </w:r>
+      <w:r>
+        <w:t xml:space="preserve">Установка разрешения входящим запросам по </w:t>
+      </w:r>
+      <w:r>
+        <w:rPr>
+          <w:lang w:val="en-US"/>
+        </w:rPr>
+        <w:t>HTTP</w:t>
+      </w:r>
+      <w:r>
+        <w:t xml:space="preserve"> </w:t>
+      </w:r>
+      <w:r>
+        <w:t>протоколу</w:t>
+      </w:r>
+    </w:p>
+    <w:p>
+      <w:pPr>
+        <w:pStyle w:val="a1"/>
+        <w:ind w:firstLine="0"/>
+        <w:jc w:val="center"/>
+        <w:rPr>
+          <w:lang w:val="en-US"/>
+        </w:rPr>
+      </w:pPr>
+      <w:r>
+        <w:rPr>
+          <w:lang w:val="en-US"/>
+        </w:rPr>
+        <w:lastRenderedPageBreak/>
+        <w:drawing>
+          <wp:inline distT="0" distB="0" distL="0" distR="0" wp14:anchorId="4F5B60CD" wp14:editId="411B91A5">
+            <wp:extent cx="5940425" cy="1964055"/>
+            <wp:effectExtent l="0" t="0" r="3175" b="0"/>
+            <wp:docPr id="767596406" name="Picture 1"/>
+            <wp:cNvGraphicFramePr>
+              <a:graphicFrameLocks xmlns:a="http://schemas.openxmlformats.org/drawingml/2006/main" noChangeAspect="1"/>
+            </wp:cNvGraphicFramePr>
+            <a:graphic xmlns:a="http://schemas.openxmlformats.org/drawingml/2006/main">
+              <a:graphicData uri="http://schemas.openxmlformats.org/drawingml/2006/picture">
+                <pic:pic xmlns:pic="http://schemas.openxmlformats.org/drawingml/2006/picture">
+                  <pic:nvPicPr>
+                    <pic:cNvPr id="767596406" name=""/>
+                    <pic:cNvPicPr/>
+                  </pic:nvPicPr>
+                  <pic:blipFill>
+                    <a:blip r:embed="rId9"/>
+                    <a:stretch>
+                      <a:fillRect/>
+                    </a:stretch>
+                  </pic:blipFill>
+                  <pic:spPr>
+                    <a:xfrm>
+                      <a:off x="0" y="0"/>
+                      <a:ext cx="5940425" cy="1964055"/>
+                    </a:xfrm>
+                    <a:prstGeom prst="rect">
+                      <a:avLst/>
+                    </a:prstGeom>
+                  </pic:spPr>
+                </pic:pic>
+              </a:graphicData>
+            </a:graphic>
+          </wp:inline>
+        </w:drawing>
+      </w:r>
+    </w:p>
+    <w:p>
+      <w:pPr>
+        <w:pStyle w:val="a1"/>
+        <w:ind w:firstLine="0"/>
+        <w:jc w:val="center"/>
+      </w:pPr>
+      <w:r>
+        <w:t xml:space="preserve">Рисунок 5 </w:t>
+      </w:r>
+      <w:r>
+        <w:t>–</w:t>
+      </w:r>
+      <w:r>
+        <w:t xml:space="preserve"> </w:t>
+      </w:r>
+      <w:r>
+        <w:t>Вывод таблицы цепочек</w:t>
+      </w:r>
+    </w:p>
+    <w:p>
+      <w:pPr>
+        <w:pStyle w:val="a1"/>
+        <w:ind w:firstLine="0"/>
+        <w:jc w:val="center"/>
+      </w:pPr>
     </w:p>
     <w:p>
       <w:pPr>
         <w:pStyle w:val="a"/>
       </w:pPr>
-    </w:p>
-    <w:p>
-      <w:pPr>
-        <w:pStyle w:val="a"/>
-      </w:pPr>
       <w:r>
         <w:t>Вывод</w:t>
       </w:r>
@@ -533,15 +921,7 @@
         <w:t>ны</w:t>
       </w:r>
       <w:r>
-        <w:t xml:space="preserve"> простейшие возможности брандмауэра на примере программы </w:t>
-      </w:r>
-      <w:proofErr w:type="spellStart"/>
-      <w:r>
-        <w:t>Iptables</w:t>
-      </w:r>
-      <w:proofErr w:type="spellEnd"/>
-      <w:r>
-        <w:t>. Изуч</w:t>
+        <w:t xml:space="preserve"> простейшие возможности брандмауэра на примере программы Iptables. Изуч</w:t>
       </w:r>
       <w:r>
         <w:t>ен</w:t>
@@ -577,9 +957,9 @@
 <w:numbering xmlns:wpc="http://schemas.microsoft.com/office/word/2010/wordprocessingCanvas" xmlns:cx="http://schemas.microsoft.com/office/drawing/2014/chartex" xmlns:cx1="http://schemas.microsoft.com/office/drawing/2015/9/8/chartex" xmlns:cx2="http://schemas.microsoft.com/office/drawing/2015/10/21/chartex" xmlns:cx3="http://schemas.microsoft.com/office/drawing/2016/5/9/chartex" xmlns:cx4="http://schemas.microsoft.com/office/drawing/2016/5/10/chartex" xmlns:cx5="http://schemas.microsoft.com/office/drawing/2016/5/11/chartex" xmlns:cx6="http://schemas.microsoft.com/office/drawing/2016/5/12/chartex" xmlns:cx7="http://schemas.microsoft.com/office/drawing/2016/5/13/chartex" xmlns:cx8="http://schemas.microsoft.com/office/drawing/2016/5/14/chartex" xmlns:mc="http://schemas.openxmlformats.org/markup-compatibility/2006" xmlns:aink="http://schemas.microsoft.com/office/drawing/2016/ink" xmlns:am3d="http://schemas.microsoft.com/office/drawing/2017/model3d" xmlns:o="urn:schemas-microsoft-com:office:office" xmlns:oel="http://schemas.microsoft.com/office/2019/extlst" xmlns:r="http://schemas.openxmlformats.org/officeDocument/2006/relationships" xmlns:m="http://schemas.openxmlformats.org/officeDocument/2006/math" xmlns:v="urn:schemas-microsoft-com:vml" xmlns:wp14="http://schemas.microsoft.com/office/word/2010/wordprocessingDrawing" xmlns:wp="http://schemas.openxmlformats.org/drawingml/2006/wordprocessingDrawing" xmlns:w10="urn:schemas-microsoft-com:office:word" xmlns:w="http://schemas.openxmlformats.org/wordprocessingml/2006/main" xmlns:w14="http://schemas.microsoft.com/office/word/2010/wordml" xmlns:w15="http://schemas.microsoft.com/office/word/2012/wordml" xmlns:w16cex="http://schemas.microsoft.com/office/word/2018/wordml/cex" xmlns:w16cid="http://schemas.microsoft.com/office/word/2016/wordml/cid" xmlns:w16="http://schemas.microsoft.com/office/word/2018/wordml" xmlns:w16du="http://schemas.microsoft.com/office/word/2023/wordml/word16du" xmlns:w16sdtdh="http://schemas.microsoft.com/office/word/2020/wordml/sdtdatahash" xmlns:w16sdtfl="http://schemas.microsoft.com/office/word/2024/wordml/sdtformatlock" xmlns:w16se="http://schemas.microsoft.com/office/word/2015/wordml/symex" xmlns:wpg="http://schemas.microsoft.com/office/word/2010/wordprocessingGroup" xmlns:wpi="http://schemas.microsoft.com/office/word/2010/wordprocessingInk" xmlns:wne="http://schemas.microsoft.com/office/word/2006/wordml" xmlns:wps="http://schemas.microsoft.com/office/word/2010/wordprocessingShape" mc:Ignorable="w14 w15 w16se w16cid w16 w16cex w16sdtdh w16sdtfl w16du wp14">
   <w:abstractNum w:abstractNumId="0" w15:restartNumberingAfterBreak="0">
     <w:nsid w:val="1DD22A82"/>
-    <w:multiLevelType w:val="hybridMultilevel"/>
-    <w:tmpl w:val="A6CC4BD6"/>
-    <w:lvl w:ilvl="0" w:tplc="034E1D98">
+    <w:multiLevelType w:val="multilevel"/>
+    <w:tmpl w:val="31C4A66C"/>
+    <w:lvl w:ilvl="0">
       <w:start w:val="1"/>
       <w:numFmt w:val="decimal"/>
       <w:suff w:val="space"/>
@@ -592,77 +972,110 @@
         <w:rFonts w:hint="default"/>
       </w:rPr>
     </w:lvl>
-    <w:lvl w:ilvl="1" w:tplc="04090019" w:tentative="1">
-      <w:start w:val="1"/>
-      <w:numFmt w:val="lowerLetter"/>
-      <w:lvlText w:val="%2."/>
+    <w:lvl w:ilvl="1">
+      <w:start w:val="1"/>
+      <w:numFmt w:val="decimal"/>
+      <w:isLgl/>
+      <w:suff w:val="space"/>
+      <w:lvlText w:val="%1.%2."/>
       <w:lvlJc w:val="left"/>
       <w:pPr>
-        <w:ind w:left="1789" w:hanging="360"/>
-      </w:pPr>
-    </w:lvl>
-    <w:lvl w:ilvl="2" w:tplc="0409001B" w:tentative="1">
-      <w:start w:val="1"/>
-      <w:numFmt w:val="lowerRoman"/>
-      <w:lvlText w:val="%3."/>
-      <w:lvlJc w:val="right"/>
-      <w:pPr>
-        <w:ind w:left="2509" w:hanging="180"/>
-      </w:pPr>
-    </w:lvl>
-    <w:lvl w:ilvl="3" w:tplc="0409000F" w:tentative="1">
+        <w:ind w:left="0" w:firstLine="709"/>
+      </w:pPr>
+      <w:rPr>
+        <w:rFonts w:hint="default"/>
+      </w:rPr>
+    </w:lvl>
+    <w:lvl w:ilvl="2">
       <w:start w:val="1"/>
       <w:numFmt w:val="decimal"/>
-      <w:lvlText w:val="%4."/>
+      <w:isLgl/>
+      <w:lvlText w:val="%1.%2.%3."/>
       <w:lvlJc w:val="left"/>
       <w:pPr>
-        <w:ind w:left="3229" w:hanging="360"/>
-      </w:pPr>
-    </w:lvl>
-    <w:lvl w:ilvl="4" w:tplc="04090019" w:tentative="1">
-      <w:start w:val="1"/>
-      <w:numFmt w:val="lowerLetter"/>
-      <w:lvlText w:val="%5."/>
+        <w:ind w:left="1429" w:hanging="720"/>
+      </w:pPr>
+      <w:rPr>
+        <w:rFonts w:hint="default"/>
+      </w:rPr>
+    </w:lvl>
+    <w:lvl w:ilvl="3">
+      <w:start w:val="1"/>
+      <w:numFmt w:val="decimal"/>
+      <w:isLgl/>
+      <w:lvlText w:val="%1.%2.%3.%4."/>
       <w:lvlJc w:val="left"/>
       <w:pPr>
-        <w:ind w:left="3949" w:hanging="360"/>
-      </w:pPr>
-    </w:lvl>
-    <w:lvl w:ilvl="5" w:tplc="0409001B" w:tentative="1">
-      <w:start w:val="1"/>
-      <w:numFmt w:val="lowerRoman"/>
-      <w:lvlText w:val="%6."/>
-      <w:lvlJc w:val="right"/>
-      <w:pPr>
-        <w:ind w:left="4669" w:hanging="180"/>
-      </w:pPr>
-    </w:lvl>
-    <w:lvl w:ilvl="6" w:tplc="0409000F" w:tentative="1">
+        <w:ind w:left="1789" w:hanging="1080"/>
+      </w:pPr>
+      <w:rPr>
+        <w:rFonts w:hint="default"/>
+      </w:rPr>
+    </w:lvl>
+    <w:lvl w:ilvl="4">
       <w:start w:val="1"/>
       <w:numFmt w:val="decimal"/>
-      <w:lvlText w:val="%7."/>
+      <w:isLgl/>
+      <w:lvlText w:val="%1.%2.%3.%4.%5."/>
       <w:lvlJc w:val="left"/>
       <w:pPr>
-        <w:ind w:left="5389" w:hanging="360"/>
-      </w:pPr>
-    </w:lvl>
-    <w:lvl w:ilvl="7" w:tplc="04090019" w:tentative="1">
-      <w:start w:val="1"/>
-      <w:numFmt w:val="lowerLetter"/>
-      <w:lvlText w:val="%8."/>
+        <w:ind w:left="1789" w:hanging="1080"/>
+      </w:pPr>
+      <w:rPr>
+        <w:rFonts w:hint="default"/>
+      </w:rPr>
+    </w:lvl>
+    <w:lvl w:ilvl="5">
+      <w:start w:val="1"/>
+      <w:numFmt w:val="decimal"/>
+      <w:isLgl/>
+      <w:lvlText w:val="%1.%2.%3.%4.%5.%6."/>
       <w:lvlJc w:val="left"/>
       <w:pPr>
-        <w:ind w:left="6109" w:hanging="360"/>
-      </w:pPr>
-    </w:lvl>
-    <w:lvl w:ilvl="8" w:tplc="0409001B" w:tentative="1">
-      <w:start w:val="1"/>
-      <w:numFmt w:val="lowerRoman"/>
-      <w:lvlText w:val="%9."/>
-      <w:lvlJc w:val="right"/>
-      <w:pPr>
-        <w:ind w:left="6829" w:hanging="180"/>
-      </w:pPr>
+        <w:ind w:left="2149" w:hanging="1440"/>
+      </w:pPr>
+      <w:rPr>
+        <w:rFonts w:hint="default"/>
+      </w:rPr>
+    </w:lvl>
+    <w:lvl w:ilvl="6">
+      <w:start w:val="1"/>
+      <w:numFmt w:val="decimal"/>
+      <w:isLgl/>
+      <w:lvlText w:val="%1.%2.%3.%4.%5.%6.%7."/>
+      <w:lvlJc w:val="left"/>
+      <w:pPr>
+        <w:ind w:left="2509" w:hanging="1800"/>
+      </w:pPr>
+      <w:rPr>
+        <w:rFonts w:hint="default"/>
+      </w:rPr>
+    </w:lvl>
+    <w:lvl w:ilvl="7">
+      <w:start w:val="1"/>
+      <w:numFmt w:val="decimal"/>
+      <w:isLgl/>
+      <w:lvlText w:val="%1.%2.%3.%4.%5.%6.%7.%8."/>
+      <w:lvlJc w:val="left"/>
+      <w:pPr>
+        <w:ind w:left="2509" w:hanging="1800"/>
+      </w:pPr>
+      <w:rPr>
+        <w:rFonts w:hint="default"/>
+      </w:rPr>
+    </w:lvl>
+    <w:lvl w:ilvl="8">
+      <w:start w:val="1"/>
+      <w:numFmt w:val="decimal"/>
+      <w:isLgl/>
+      <w:lvlText w:val="%1.%2.%3.%4.%5.%6.%7.%8.%9."/>
+      <w:lvlJc w:val="left"/>
+      <w:pPr>
+        <w:ind w:left="2869" w:hanging="2160"/>
+      </w:pPr>
+      <w:rPr>
+        <w:rFonts w:hint="default"/>
+      </w:rPr>
     </w:lvl>
   </w:abstractNum>
   <w:abstractNum w:abstractNumId="1" w15:restartNumberingAfterBreak="0">
@@ -1498,6 +1911,7 @@
   <w:style w:type="character" w:default="1" w:styleId="DefaultParagraphFont">
     <w:name w:val="Default Paragraph Font"/>
     <w:uiPriority w:val="1"/>
+    <w:semiHidden/>
     <w:unhideWhenUsed/>
   </w:style>
   <w:style w:type="table" w:default="1" w:styleId="TableNormal">

</xml_diff>